<commit_message>
IT Cálculo dos Indicadores do PVP: detalhe do avanço/atraso por C.C. e cálculos do Histórico com imagens
Co-Authored-By: Claude Opus 5.5 <noreply@anthropic.com>
Claude-Session: https://claude.ai/code/session_01S5dQPeCkEovFL6vojBFBfd
</commit_message>
<xml_diff>
--- a/IT_Calculo_Indicadores_PVP.docx
+++ b/IT_Calculo_Indicadores_PVP.docx
@@ -1002,12 +1002,9 @@
     </w:p>
     <w:p>
       <w:pPr>
-        <w:pStyle w:val="ListParagraph"/>
-        <w:numPr>
-          <w:ilvl w:val="0"/>
-          <w:numId w:val="27"/>
-        </w:numPr>
-        <w:spacing w:before="240"/>
+        <w:keepNext/>
+        <w:spacing w:before="200" w:after="60"/>
+        <w:ind w:left="720"/>
         <w:rPr>
           <w:sz w:val="20"/>
           <w:lang w:val="pt-PT"/>
@@ -1018,20 +1015,32 @@
           <w:rFonts w:cs="Segoe UI"/>
           <w:b/>
           <w:bCs/>
-          <w:sz w:val="20"/>
-          <w:szCs w:val="20"/>
-          <w:lang w:val="pt-PT"/>
-        </w:rPr>
-        <w:t xml:space="preserve">Material em risco de falha</w:t>
-      </w:r>
-      <w:r>
-        <w:rPr>
-          <w:rFonts w:cs="Segoe UI"/>
-          <w:sz w:val="20"/>
-          <w:szCs w:val="20"/>
-          <w:lang w:val="pt-PT"/>
-        </w:rPr>
-        <w:t xml:space="preserve">.</w:t>
+          <w:u w:val="single"/>
+          <w:sz w:val="20"/>
+          <w:szCs w:val="20"/>
+          <w:lang w:val="pt-PT"/>
+        </w:rPr>
+        <w:t xml:space="preserve">Detalhe do avanço/atraso</w:t>
+      </w:r>
+    </w:p>
+    <w:p>
+      <w:pPr>
+        <w:spacing w:after="60"/>
+        <w:ind w:left="720"/>
+        <w:jc w:val="both"/>
+        <w:rPr>
+          <w:sz w:val="20"/>
+          <w:lang w:val="pt-PT"/>
+        </w:rPr>
+      </w:pPr>
+      <w:r>
+        <w:rPr>
+          <w:rFonts w:cs="Segoe UI"/>
+          <w:sz w:val="20"/>
+          <w:szCs w:val="20"/>
+          <w:lang w:val="pt-PT"/>
+        </w:rPr>
+        <w:t xml:space="preserve">Ao clicar no valor de avanço/atraso do cartão abre-se o detalhe da conta, linha a linha:</w:t>
       </w:r>
     </w:p>
     <w:p>
@@ -1047,7 +1056,7 @@
         </w:rPr>
         <w:drawing>
           <wp:inline distT="0" distB="0" distL="0" distR="0">
-            <wp:extent cx="5400000" cy="2960662"/>
+            <wp:extent cx="4680000" cy="3708679"/>
             <wp:effectExtent l="0" t="0" r="0" b="0"/>
             <wp:docPr id="9002" name="Imagem 9002"/>
             <wp:cNvGraphicFramePr>
@@ -1057,11 +1066,617 @@
               <a:graphicData uri="http://schemas.openxmlformats.org/drawingml/2006/picture">
                 <pic:pic xmlns:pic="http://schemas.openxmlformats.org/drawingml/2006/picture">
                   <pic:nvPicPr>
-                    <pic:cNvPr id="9002" name="pvp_08_risco.png"/>
+                    <pic:cNvPr id="9002" name="pvp_07_popup_delta.png"/>
                     <pic:cNvPicPr/>
                   </pic:nvPicPr>
                   <pic:blipFill>
                     <a:blip r:embed="rId502"/>
+                    <a:stretch>
+                      <a:fillRect/>
+                    </a:stretch>
+                  </pic:blipFill>
+                  <pic:spPr>
+                    <a:xfrm>
+                      <a:off x="0" y="0"/>
+                      <a:ext cx="4680000" cy="3708679"/>
+                    </a:xfrm>
+                    <a:prstGeom prst="rect">
+                      <a:avLst/>
+                    </a:prstGeom>
+                  </pic:spPr>
+                </pic:pic>
+              </a:graphicData>
+            </a:graphic>
+          </wp:inline>
+        </w:drawing>
+      </w:r>
+    </w:p>
+    <w:p>
+      <w:pPr>
+        <w:spacing w:after="60"/>
+        <w:ind w:left="720"/>
+        <w:jc w:val="both"/>
+        <w:rPr>
+          <w:sz w:val="20"/>
+          <w:lang w:val="pt-PT"/>
+        </w:rPr>
+      </w:pPr>
+      <w:r>
+        <w:rPr>
+          <w:rFonts w:cs="Segoe UI"/>
+          <w:b/>
+          <w:bCs/>
+          <w:sz w:val="20"/>
+          <w:szCs w:val="20"/>
+          <w:lang w:val="pt-PT"/>
+        </w:rPr>
+        <w:t xml:space="preserve">Resumo (topo):</w:t>
+      </w:r>
+      <w:r>
+        <w:rPr>
+          <w:rFonts w:cs="Segoe UI"/>
+          <w:sz w:val="20"/>
+          <w:szCs w:val="20"/>
+          <w:lang w:val="pt-PT"/>
+        </w:rPr>
+        <w:t xml:space="preserve"/>
+      </w:r>
+    </w:p>
+    <w:p>
+      <w:pPr>
+        <w:spacing w:after="40"/>
+        <w:ind w:left="1080" w:hanging="220"/>
+        <w:jc w:val="both"/>
+        <w:rPr>
+          <w:sz w:val="20"/>
+          <w:lang w:val="pt-PT"/>
+        </w:rPr>
+      </w:pPr>
+      <w:r>
+        <w:rPr>
+          <w:rFonts w:cs="Segoe UI"/>
+          <w:sz w:val="20"/>
+          <w:szCs w:val="20"/>
+          <w:lang w:val="pt-PT"/>
+        </w:rPr>
+        <w:t xml:space="preserve">– </w:t>
+      </w:r>
+      <w:r>
+        <w:rPr>
+          <w:rFonts w:cs="Segoe UI"/>
+          <w:b/>
+          <w:bCs/>
+          <w:sz w:val="20"/>
+          <w:szCs w:val="20"/>
+          <w:lang w:val="pt-PT"/>
+        </w:rPr>
+        <w:t xml:space="preserve">Planeado (datas até hoje e backlog)</w:t>
+      </w:r>
+      <w:r>
+        <w:rPr>
+          <w:rFonts w:cs="Segoe UI"/>
+          <w:sz w:val="20"/>
+          <w:szCs w:val="20"/>
+          <w:lang w:val="pt-PT"/>
+        </w:rPr>
+        <w:t xml:space="preserve">: soma das horas planeadas dos dias do período até hoje e do backlog;</w:t>
+      </w:r>
+    </w:p>
+    <w:p>
+      <w:pPr>
+        <w:spacing w:after="40"/>
+        <w:ind w:left="1080" w:hanging="220"/>
+        <w:jc w:val="both"/>
+        <w:rPr>
+          <w:sz w:val="20"/>
+          <w:lang w:val="pt-PT"/>
+        </w:rPr>
+      </w:pPr>
+      <w:r>
+        <w:rPr>
+          <w:rFonts w:cs="Segoe UI"/>
+          <w:sz w:val="20"/>
+          <w:szCs w:val="20"/>
+          <w:lang w:val="pt-PT"/>
+        </w:rPr>
+        <w:t xml:space="preserve">– </w:t>
+      </w:r>
+      <w:r>
+        <w:rPr>
+          <w:rFonts w:cs="Segoe UI"/>
+          <w:b/>
+          <w:bCs/>
+          <w:sz w:val="20"/>
+          <w:szCs w:val="20"/>
+          <w:lang w:val="pt-PT"/>
+        </w:rPr>
+        <w:t xml:space="preserve">Produzido (inclui datas futuras já produzidas)</w:t>
+      </w:r>
+      <w:r>
+        <w:rPr>
+          <w:rFonts w:cs="Segoe UI"/>
+          <w:sz w:val="20"/>
+          <w:szCs w:val="20"/>
+          <w:lang w:val="pt-PT"/>
+        </w:rPr>
+        <w:t xml:space="preserve">: soma das horas já produzidas, incluindo trabalho adiantado de dias seguintes;</w:t>
+      </w:r>
+    </w:p>
+    <w:p>
+      <w:pPr>
+        <w:spacing w:after="40"/>
+        <w:ind w:left="1080" w:hanging="220"/>
+        <w:jc w:val="both"/>
+        <w:rPr>
+          <w:sz w:val="20"/>
+          <w:lang w:val="pt-PT"/>
+        </w:rPr>
+      </w:pPr>
+      <w:r>
+        <w:rPr>
+          <w:rFonts w:cs="Segoe UI"/>
+          <w:sz w:val="20"/>
+          <w:szCs w:val="20"/>
+          <w:lang w:val="pt-PT"/>
+        </w:rPr>
+        <w:t xml:space="preserve">– </w:t>
+      </w:r>
+      <w:r>
+        <w:rPr>
+          <w:rFonts w:cs="Segoe UI"/>
+          <w:b/>
+          <w:bCs/>
+          <w:sz w:val="20"/>
+          <w:szCs w:val="20"/>
+          <w:lang w:val="pt-PT"/>
+        </w:rPr>
+        <w:t xml:space="preserve">Horas de trabalho que ainda faltam hoje</w:t>
+      </w:r>
+      <w:r>
+        <w:rPr>
+          <w:rFonts w:cs="Segoe UI"/>
+          <w:sz w:val="20"/>
+          <w:szCs w:val="20"/>
+          <w:lang w:val="pt-PT"/>
+        </w:rPr>
+        <w:t xml:space="preserve">: tempo de trabalho que resta até ao fim do dia;</w:t>
+      </w:r>
+    </w:p>
+    <w:p>
+      <w:pPr>
+        <w:spacing w:after="40"/>
+        <w:ind w:left="1080" w:hanging="220"/>
+        <w:jc w:val="both"/>
+        <w:rPr>
+          <w:sz w:val="20"/>
+          <w:lang w:val="pt-PT"/>
+        </w:rPr>
+      </w:pPr>
+      <w:r>
+        <w:rPr>
+          <w:rFonts w:cs="Segoe UI"/>
+          <w:sz w:val="20"/>
+          <w:szCs w:val="20"/>
+          <w:lang w:val="pt-PT"/>
+        </w:rPr>
+        <w:t xml:space="preserve">– </w:t>
+      </w:r>
+      <w:r>
+        <w:rPr>
+          <w:rFonts w:cs="Segoe UI"/>
+          <w:b/>
+          <w:bCs/>
+          <w:sz w:val="20"/>
+          <w:szCs w:val="20"/>
+          <w:lang w:val="pt-PT"/>
+        </w:rPr>
+        <w:t xml:space="preserve">Resultado</w:t>
+      </w:r>
+      <w:r>
+        <w:rPr>
+          <w:rFonts w:cs="Segoe UI"/>
+          <w:sz w:val="20"/>
+          <w:szCs w:val="20"/>
+          <w:lang w:val="pt-PT"/>
+        </w:rPr>
+        <w:t xml:space="preserve"> (Em atraso / Em avanço): produzido – planeado + horas que faltam hoje.</w:t>
+      </w:r>
+    </w:p>
+    <w:p>
+      <w:pPr>
+        <w:spacing w:after="60"/>
+        <w:ind w:left="720"/>
+        <w:jc w:val="both"/>
+        <w:rPr>
+          <w:sz w:val="20"/>
+          <w:lang w:val="pt-PT"/>
+        </w:rPr>
+      </w:pPr>
+      <w:r>
+        <w:rPr>
+          <w:rFonts w:cs="Segoe UI"/>
+          <w:b/>
+          <w:bCs/>
+          <w:sz w:val="20"/>
+          <w:szCs w:val="20"/>
+          <w:lang w:val="pt-PT"/>
+        </w:rPr>
+        <w:t xml:space="preserve">Exemplo da imagem:</w:t>
+      </w:r>
+      <w:r>
+        <w:rPr>
+          <w:rFonts w:cs="Segoe UI"/>
+          <w:sz w:val="20"/>
+          <w:szCs w:val="20"/>
+          <w:lang w:val="pt-PT"/>
+        </w:rPr>
+        <w:t xml:space="preserve"> 18:00 – 47:00 + 13:45 = –15:15 (15 horas e 15 minutos de atraso).</w:t>
+      </w:r>
+    </w:p>
+    <w:p>
+      <w:pPr>
+        <w:spacing w:after="60"/>
+        <w:ind w:left="720"/>
+        <w:jc w:val="both"/>
+        <w:rPr>
+          <w:sz w:val="20"/>
+          <w:lang w:val="pt-PT"/>
+        </w:rPr>
+      </w:pPr>
+      <w:r>
+        <w:rPr>
+          <w:rFonts w:cs="Segoe UI"/>
+          <w:b/>
+          <w:bCs/>
+          <w:sz w:val="20"/>
+          <w:szCs w:val="20"/>
+          <w:lang w:val="pt-PT"/>
+        </w:rPr>
+        <w:t xml:space="preserve">Tabela (uma linha por KA):</w:t>
+      </w:r>
+      <w:r>
+        <w:rPr>
+          <w:rFonts w:cs="Segoe UI"/>
+          <w:sz w:val="20"/>
+          <w:szCs w:val="20"/>
+          <w:lang w:val="pt-PT"/>
+        </w:rPr>
+        <w:t xml:space="preserve"/>
+      </w:r>
+    </w:p>
+    <w:p>
+      <w:pPr>
+        <w:spacing w:after="40"/>
+        <w:ind w:left="1080" w:hanging="220"/>
+        <w:jc w:val="both"/>
+        <w:rPr>
+          <w:sz w:val="20"/>
+          <w:lang w:val="pt-PT"/>
+        </w:rPr>
+      </w:pPr>
+      <w:r>
+        <w:rPr>
+          <w:rFonts w:cs="Segoe UI"/>
+          <w:sz w:val="20"/>
+          <w:szCs w:val="20"/>
+          <w:lang w:val="pt-PT"/>
+        </w:rPr>
+        <w:t xml:space="preserve">– </w:t>
+      </w:r>
+      <w:r>
+        <w:rPr>
+          <w:rFonts w:cs="Segoe UI"/>
+          <w:b/>
+          <w:bCs/>
+          <w:sz w:val="20"/>
+          <w:szCs w:val="20"/>
+          <w:lang w:val="pt-PT"/>
+        </w:rPr>
+        <w:t xml:space="preserve">Data</w:t>
+      </w:r>
+      <w:r>
+        <w:rPr>
+          <w:rFonts w:cs="Segoe UI"/>
+          <w:sz w:val="20"/>
+          <w:szCs w:val="20"/>
+          <w:lang w:val="pt-PT"/>
+        </w:rPr>
+        <w:t xml:space="preserve">: data planeada do item (o backlog aparece com a etiqueta «Backlog»);</w:t>
+      </w:r>
+    </w:p>
+    <w:p>
+      <w:pPr>
+        <w:spacing w:after="40"/>
+        <w:ind w:left="1080" w:hanging="220"/>
+        <w:jc w:val="both"/>
+        <w:rPr>
+          <w:sz w:val="20"/>
+          <w:lang w:val="pt-PT"/>
+        </w:rPr>
+      </w:pPr>
+      <w:r>
+        <w:rPr>
+          <w:rFonts w:cs="Segoe UI"/>
+          <w:sz w:val="20"/>
+          <w:szCs w:val="20"/>
+          <w:lang w:val="pt-PT"/>
+        </w:rPr>
+        <w:t xml:space="preserve">– </w:t>
+      </w:r>
+      <w:r>
+        <w:rPr>
+          <w:rFonts w:cs="Segoe UI"/>
+          <w:b/>
+          <w:bCs/>
+          <w:sz w:val="20"/>
+          <w:szCs w:val="20"/>
+          <w:lang w:val="pt-PT"/>
+        </w:rPr>
+        <w:t xml:space="preserve">Origem</w:t>
+      </w:r>
+      <w:r>
+        <w:rPr>
+          <w:rFonts w:cs="Segoe UI"/>
+          <w:sz w:val="20"/>
+          <w:szCs w:val="20"/>
+          <w:lang w:val="pt-PT"/>
+        </w:rPr>
+        <w:t xml:space="preserve">: Plano, Ensaio (ensaio de ferramenta) ou Backlog;</w:t>
+      </w:r>
+    </w:p>
+    <w:p>
+      <w:pPr>
+        <w:spacing w:after="40"/>
+        <w:ind w:left="1080" w:hanging="220"/>
+        <w:jc w:val="both"/>
+        <w:rPr>
+          <w:sz w:val="20"/>
+          <w:lang w:val="pt-PT"/>
+        </w:rPr>
+      </w:pPr>
+      <w:r>
+        <w:rPr>
+          <w:rFonts w:cs="Segoe UI"/>
+          <w:sz w:val="20"/>
+          <w:szCs w:val="20"/>
+          <w:lang w:val="pt-PT"/>
+        </w:rPr>
+        <w:t xml:space="preserve">– </w:t>
+      </w:r>
+      <w:r>
+        <w:rPr>
+          <w:rFonts w:cs="Segoe UI"/>
+          <w:b/>
+          <w:bCs/>
+          <w:sz w:val="20"/>
+          <w:szCs w:val="20"/>
+          <w:lang w:val="pt-PT"/>
+        </w:rPr>
+        <w:t xml:space="preserve">Status</w:t>
+      </w:r>
+      <w:r>
+        <w:rPr>
+          <w:rFonts w:cs="Segoe UI"/>
+          <w:sz w:val="20"/>
+          <w:szCs w:val="20"/>
+          <w:lang w:val="pt-PT"/>
+        </w:rPr>
+        <w:t xml:space="preserve">: estado atual do item no plano;</w:t>
+      </w:r>
+    </w:p>
+    <w:p>
+      <w:pPr>
+        <w:spacing w:after="40"/>
+        <w:ind w:left="1080" w:hanging="220"/>
+        <w:jc w:val="both"/>
+        <w:rPr>
+          <w:sz w:val="20"/>
+          <w:lang w:val="pt-PT"/>
+        </w:rPr>
+      </w:pPr>
+      <w:r>
+        <w:rPr>
+          <w:rFonts w:cs="Segoe UI"/>
+          <w:sz w:val="20"/>
+          <w:szCs w:val="20"/>
+          <w:lang w:val="pt-PT"/>
+        </w:rPr>
+        <w:t xml:space="preserve">– </w:t>
+      </w:r>
+      <w:r>
+        <w:rPr>
+          <w:rFonts w:cs="Segoe UI"/>
+          <w:b/>
+          <w:bCs/>
+          <w:sz w:val="20"/>
+          <w:szCs w:val="20"/>
+          <w:lang w:val="pt-PT"/>
+        </w:rPr>
+        <w:t xml:space="preserve">Planeado / Produzido</w:t>
+      </w:r>
+      <w:r>
+        <w:rPr>
+          <w:rFonts w:cs="Segoe UI"/>
+          <w:sz w:val="20"/>
+          <w:szCs w:val="20"/>
+          <w:lang w:val="pt-PT"/>
+        </w:rPr>
+        <w:t xml:space="preserve">: horas planeadas e horas já produzidas do item;</w:t>
+      </w:r>
+    </w:p>
+    <w:p>
+      <w:pPr>
+        <w:spacing w:after="40"/>
+        <w:ind w:left="1080" w:hanging="220"/>
+        <w:jc w:val="both"/>
+        <w:rPr>
+          <w:sz w:val="20"/>
+          <w:lang w:val="pt-PT"/>
+        </w:rPr>
+      </w:pPr>
+      <w:r>
+        <w:rPr>
+          <w:rFonts w:cs="Segoe UI"/>
+          <w:sz w:val="20"/>
+          <w:szCs w:val="20"/>
+          <w:lang w:val="pt-PT"/>
+        </w:rPr>
+        <w:t xml:space="preserve">– </w:t>
+      </w:r>
+      <w:r>
+        <w:rPr>
+          <w:rFonts w:cs="Segoe UI"/>
+          <w:b/>
+          <w:bCs/>
+          <w:sz w:val="20"/>
+          <w:szCs w:val="20"/>
+          <w:lang w:val="pt-PT"/>
+        </w:rPr>
+        <w:t xml:space="preserve">Contributo</w:t>
+      </w:r>
+      <w:r>
+        <w:rPr>
+          <w:rFonts w:cs="Segoe UI"/>
+          <w:sz w:val="20"/>
+          <w:szCs w:val="20"/>
+          <w:lang w:val="pt-PT"/>
+        </w:rPr>
+        <w:t xml:space="preserve">: quanto o item pesa no resultado = produzido – planeado. Um item produzido dá 0:00; um item por produzir dá o atraso das suas horas (ex.: 6:00 planeadas e nada produzido → –6:00). Nos dias futuros só conta o que já foi produzido, por isso um item futuro ainda por produzir dá 0:00.</w:t>
+      </w:r>
+    </w:p>
+    <w:p>
+      <w:pPr>
+        <w:spacing w:after="60"/>
+        <w:ind w:left="720"/>
+        <w:jc w:val="both"/>
+        <w:rPr>
+          <w:sz w:val="20"/>
+          <w:lang w:val="pt-PT"/>
+        </w:rPr>
+      </w:pPr>
+      <w:r>
+        <w:rPr>
+          <w:rFonts w:cs="Segoe UI"/>
+          <w:b/>
+          <w:bCs/>
+          <w:sz w:val="20"/>
+          <w:szCs w:val="20"/>
+          <w:lang w:val="pt-PT"/>
+        </w:rPr>
+        <w:t xml:space="preserve">Total das linhas:</w:t>
+      </w:r>
+      <w:r>
+        <w:rPr>
+          <w:rFonts w:cs="Segoe UI"/>
+          <w:sz w:val="20"/>
+          <w:szCs w:val="20"/>
+          <w:lang w:val="pt-PT"/>
+        </w:rPr>
+        <w:t xml:space="preserve"> soma das colunas. O resultado do topo é o contributo total mais as horas que ainda faltam hoje (no exemplo: –29:00 + 13:45 = –15:15).</w:t>
+      </w:r>
+    </w:p>
+    <w:p>
+      <w:pPr>
+        <w:spacing w:after="60"/>
+        <w:ind w:left="720"/>
+        <w:jc w:val="both"/>
+        <w:rPr>
+          <w:sz w:val="20"/>
+          <w:lang w:val="pt-PT"/>
+        </w:rPr>
+      </w:pPr>
+      <w:r>
+        <w:rPr>
+          <w:rFonts w:cs="Segoe UI"/>
+          <w:sz w:val="20"/>
+          <w:szCs w:val="20"/>
+          <w:lang w:val="pt-PT"/>
+        </w:rPr>
+        <w:t xml:space="preserve">Ao clicar no cartão </w:t>
+      </w:r>
+      <w:r>
+        <w:rPr>
+          <w:rFonts w:cs="Segoe UI"/>
+          <w:b/>
+          <w:bCs/>
+          <w:sz w:val="20"/>
+          <w:szCs w:val="20"/>
+          <w:lang w:val="pt-PT"/>
+        </w:rPr>
+        <w:t xml:space="preserve">Total em atraso / Total avanço</w:t>
+      </w:r>
+      <w:r>
+        <w:rPr>
+          <w:rFonts w:cs="Segoe UI"/>
+          <w:sz w:val="20"/>
+          <w:szCs w:val="20"/>
+          <w:lang w:val="pt-PT"/>
+        </w:rPr>
+        <w:t xml:space="preserve"> abre-se o mesmo detalhe com todos os C.C. da área (com uma coluna «C.C.» a identificar cada linha).</w:t>
+      </w:r>
+    </w:p>
+    <w:p>
+      <w:pPr>
+        <w:pStyle w:val="ListParagraph"/>
+        <w:numPr>
+          <w:ilvl w:val="0"/>
+          <w:numId w:val="27"/>
+        </w:numPr>
+        <w:spacing w:before="240"/>
+        <w:rPr>
+          <w:sz w:val="20"/>
+          <w:lang w:val="pt-PT"/>
+        </w:rPr>
+      </w:pPr>
+      <w:r>
+        <w:rPr>
+          <w:rFonts w:cs="Segoe UI"/>
+          <w:b/>
+          <w:bCs/>
+          <w:sz w:val="20"/>
+          <w:szCs w:val="20"/>
+          <w:lang w:val="pt-PT"/>
+        </w:rPr>
+        <w:t xml:space="preserve">Material em risco de falha</w:t>
+      </w:r>
+      <w:r>
+        <w:rPr>
+          <w:rFonts w:cs="Segoe UI"/>
+          <w:sz w:val="20"/>
+          <w:szCs w:val="20"/>
+          <w:lang w:val="pt-PT"/>
+        </w:rPr>
+        <w:t xml:space="preserve">.</w:t>
+      </w:r>
+    </w:p>
+    <w:p>
+      <w:pPr>
+        <w:keepNext/>
+        <w:spacing w:before="120" w:after="60"/>
+        <w:jc w:val="center"/>
+      </w:pPr>
+      <w:r>
+        <w:rPr>
+          <w:noProof/>
+          <w:lang w:val="pt-PT"/>
+        </w:rPr>
+        <w:drawing>
+          <wp:inline distT="0" distB="0" distL="0" distR="0">
+            <wp:extent cx="5400000" cy="2960662"/>
+            <wp:effectExtent l="0" t="0" r="0" b="0"/>
+            <wp:docPr id="9003" name="Imagem 9003"/>
+            <wp:cNvGraphicFramePr>
+              <a:graphicFrameLocks xmlns:a="http://schemas.openxmlformats.org/drawingml/2006/main" noChangeAspect="1"/>
+            </wp:cNvGraphicFramePr>
+            <a:graphic xmlns:a="http://schemas.openxmlformats.org/drawingml/2006/main">
+              <a:graphicData uri="http://schemas.openxmlformats.org/drawingml/2006/picture">
+                <pic:pic xmlns:pic="http://schemas.openxmlformats.org/drawingml/2006/picture">
+                  <pic:nvPicPr>
+                    <pic:cNvPr id="9003" name="pvp_08_risco.png"/>
+                    <pic:cNvPicPr/>
+                  </pic:nvPicPr>
+                  <pic:blipFill>
+                    <a:blip r:embed="rId503"/>
                     <a:stretch>
                       <a:fillRect/>
                     </a:stretch>
@@ -1420,7 +2035,7 @@
           <wp:inline distT="0" distB="0" distL="0" distR="0">
             <wp:extent cx="5400000" cy="2170893"/>
             <wp:effectExtent l="0" t="0" r="0" b="0"/>
-            <wp:docPr id="9003" name="Imagem 9003"/>
+            <wp:docPr id="9004" name="Imagem 9004"/>
             <wp:cNvGraphicFramePr>
               <a:graphicFrameLocks xmlns:a="http://schemas.openxmlformats.org/drawingml/2006/main" noChangeAspect="1"/>
             </wp:cNvGraphicFramePr>
@@ -1428,11 +2043,11 @@
               <a:graphicData uri="http://schemas.openxmlformats.org/drawingml/2006/picture">
                 <pic:pic xmlns:pic="http://schemas.openxmlformats.org/drawingml/2006/picture">
                   <pic:nvPicPr>
-                    <pic:cNvPr id="9003" name="pvp_09_mod.png"/>
+                    <pic:cNvPr id="9004" name="pvp_09_mod.png"/>
                     <pic:cNvPicPr/>
                   </pic:nvPicPr>
                   <pic:blipFill>
-                    <a:blip r:embed="rId503"/>
+                    <a:blip r:embed="rId504"/>
                     <a:stretch>
                       <a:fillRect/>
                     </a:stretch>
@@ -1522,7 +2137,7 @@
           <wp:inline distT="0" distB="0" distL="0" distR="0">
             <wp:extent cx="5040000" cy="2440115"/>
             <wp:effectExtent l="0" t="0" r="0" b="0"/>
-            <wp:docPr id="9004" name="Imagem 9004"/>
+            <wp:docPr id="9005" name="Imagem 9005"/>
             <wp:cNvGraphicFramePr>
               <a:graphicFrameLocks xmlns:a="http://schemas.openxmlformats.org/drawingml/2006/main" noChangeAspect="1"/>
             </wp:cNvGraphicFramePr>
@@ -1530,11 +2145,11 @@
               <a:graphicData uri="http://schemas.openxmlformats.org/drawingml/2006/picture">
                 <pic:pic xmlns:pic="http://schemas.openxmlformats.org/drawingml/2006/picture">
                   <pic:nvPicPr>
-                    <pic:cNvPr id="9004" name="pvp_10_te.png"/>
+                    <pic:cNvPr id="9005" name="pvp_10_te.png"/>
                     <pic:cNvPicPr/>
                   </pic:nvPicPr>
                   <pic:blipFill>
-                    <a:blip r:embed="rId504"/>
+                    <a:blip r:embed="rId505"/>
                     <a:stretch>
                       <a:fillRect/>
                     </a:stretch>
@@ -1861,6 +2476,77 @@
     </w:p>
     <w:p>
       <w:pPr>
+        <w:keepNext/>
+        <w:spacing w:before="200" w:after="60"/>
+        <w:ind w:left="720"/>
+        <w:rPr>
+          <w:sz w:val="20"/>
+          <w:lang w:val="pt-PT"/>
+        </w:rPr>
+      </w:pPr>
+      <w:r>
+        <w:rPr>
+          <w:rFonts w:cs="Segoe UI"/>
+          <w:b/>
+          <w:bCs/>
+          <w:u w:val="single"/>
+          <w:sz w:val="20"/>
+          <w:szCs w:val="20"/>
+          <w:lang w:val="pt-PT"/>
+        </w:rPr>
+        <w:t xml:space="preserve">Indicadores do Histórico</w:t>
+      </w:r>
+    </w:p>
+    <w:p>
+      <w:pPr>
+        <w:keepNext/>
+        <w:spacing w:before="120" w:after="60"/>
+        <w:jc w:val="center"/>
+      </w:pPr>
+      <w:r>
+        <w:rPr>
+          <w:noProof/>
+          <w:lang w:val="pt-PT"/>
+        </w:rPr>
+        <w:drawing>
+          <wp:inline distT="0" distB="0" distL="0" distR="0">
+            <wp:extent cx="6120000" cy="424180"/>
+            <wp:effectExtent l="0" t="0" r="0" b="0"/>
+            <wp:docPr id="9006" name="Imagem 9006"/>
+            <wp:cNvGraphicFramePr>
+              <a:graphicFrameLocks xmlns:a="http://schemas.openxmlformats.org/drawingml/2006/main" noChangeAspect="1"/>
+            </wp:cNvGraphicFramePr>
+            <a:graphic xmlns:a="http://schemas.openxmlformats.org/drawingml/2006/main">
+              <a:graphicData uri="http://schemas.openxmlformats.org/drawingml/2006/picture">
+                <pic:pic xmlns:pic="http://schemas.openxmlformats.org/drawingml/2006/picture">
+                  <pic:nvPicPr>
+                    <pic:cNvPr id="9006" name="pvp_12_hist_kpis.png"/>
+                    <pic:cNvPicPr/>
+                  </pic:nvPicPr>
+                  <pic:blipFill>
+                    <a:blip r:embed="rId506"/>
+                    <a:stretch>
+                      <a:fillRect/>
+                    </a:stretch>
+                  </pic:blipFill>
+                  <pic:spPr>
+                    <a:xfrm>
+                      <a:off x="0" y="0"/>
+                      <a:ext cx="6120000" cy="424180"/>
+                    </a:xfrm>
+                    <a:prstGeom prst="rect">
+                      <a:avLst/>
+                    </a:prstGeom>
+                  </pic:spPr>
+                </pic:pic>
+              </a:graphicData>
+            </a:graphic>
+          </wp:inline>
+        </w:drawing>
+      </w:r>
+    </w:p>
+    <w:p>
+      <w:pPr>
         <w:spacing w:after="40"/>
         <w:ind w:left="1080" w:hanging="220"/>
         <w:jc w:val="both"/>
@@ -1901,6 +2587,37 @@
     </w:p>
     <w:p>
       <w:pPr>
+        <w:spacing w:after="60"/>
+        <w:ind w:left="1080"/>
+        <w:jc w:val="both"/>
+        <w:rPr>
+          <w:sz w:val="20"/>
+          <w:lang w:val="pt-PT"/>
+        </w:rPr>
+      </w:pPr>
+      <w:r>
+        <w:rPr>
+          <w:rFonts w:cs="Segoe UI"/>
+          <w:b/>
+          <w:bCs/>
+          <w:sz w:val="20"/>
+          <w:szCs w:val="20"/>
+          <w:lang w:val="pt-PT"/>
+        </w:rPr>
+        <w:t xml:space="preserve">Exemplo:</w:t>
+      </w:r>
+      <w:r>
+        <w:rPr>
+          <w:rFonts w:cs="Segoe UI"/>
+          <w:sz w:val="20"/>
+          <w:szCs w:val="20"/>
+          <w:lang w:val="pt-PT"/>
+        </w:rPr>
+        <w:t xml:space="preserve"> 19 897 ÷ 34 700 = 57%.</w:t>
+      </w:r>
+    </w:p>
+    <w:p>
+      <w:pPr>
         <w:spacing w:after="40"/>
         <w:ind w:left="1080" w:hanging="220"/>
         <w:jc w:val="both"/>
@@ -1936,7 +2653,7 @@
           <w:szCs w:val="20"/>
           <w:lang w:val="pt-PT"/>
         </w:rPr>
-        <w:t xml:space="preserve">: soma das peças produzidas e das planeadas.</w:t>
+        <w:t xml:space="preserve">: soma das peças produzidas e soma das peças planeadas.</w:t>
       </w:r>
     </w:p>
     <w:p>
@@ -1976,7 +2693,38 @@
           <w:szCs w:val="20"/>
           <w:lang w:val="pt-PT"/>
         </w:rPr>
-        <w:t xml:space="preserve">: dos itens com data de produção, quantos foram produzidos até à data planeada.</w:t>
+        <w:t xml:space="preserve">: dos itens com data de produção, a percentagem produzida até à data planeada (no próprio dia ou antes).</w:t>
+      </w:r>
+    </w:p>
+    <w:p>
+      <w:pPr>
+        <w:spacing w:after="60"/>
+        <w:ind w:left="1080"/>
+        <w:jc w:val="both"/>
+        <w:rPr>
+          <w:sz w:val="20"/>
+          <w:lang w:val="pt-PT"/>
+        </w:rPr>
+      </w:pPr>
+      <w:r>
+        <w:rPr>
+          <w:rFonts w:cs="Segoe UI"/>
+          <w:b/>
+          <w:bCs/>
+          <w:sz w:val="20"/>
+          <w:szCs w:val="20"/>
+          <w:lang w:val="pt-PT"/>
+        </w:rPr>
+        <w:t xml:space="preserve">Exemplo:</w:t>
+      </w:r>
+      <w:r>
+        <w:rPr>
+          <w:rFonts w:cs="Segoe UI"/>
+          <w:sz w:val="20"/>
+          <w:szCs w:val="20"/>
+          <w:lang w:val="pt-PT"/>
+        </w:rPr>
+        <w:t xml:space="preserve"> 100 itens produzidos, 93 até à data planeada → 93%.</w:t>
       </w:r>
     </w:p>
     <w:p>
@@ -2016,7 +2764,38 @@
           <w:szCs w:val="20"/>
           <w:lang w:val="pt-PT"/>
         </w:rPr>
-        <w:t xml:space="preserve">: dos itens produzidos depois da data planeada, a média dos dias de diferença.</w:t>
+        <w:t xml:space="preserve">: considera só os itens produzidos depois da data planeada e faz a média dos dias de diferença. Os itens no prazo ou adiantados não entram.</w:t>
+      </w:r>
+    </w:p>
+    <w:p>
+      <w:pPr>
+        <w:spacing w:after="60"/>
+        <w:ind w:left="1080"/>
+        <w:jc w:val="both"/>
+        <w:rPr>
+          <w:sz w:val="20"/>
+          <w:lang w:val="pt-PT"/>
+        </w:rPr>
+      </w:pPr>
+      <w:r>
+        <w:rPr>
+          <w:rFonts w:cs="Segoe UI"/>
+          <w:b/>
+          <w:bCs/>
+          <w:sz w:val="20"/>
+          <w:szCs w:val="20"/>
+          <w:lang w:val="pt-PT"/>
+        </w:rPr>
+        <w:t xml:space="preserve">Exemplo:</w:t>
+      </w:r>
+      <w:r>
+        <w:rPr>
+          <w:rFonts w:cs="Segoe UI"/>
+          <w:sz w:val="20"/>
+          <w:szCs w:val="20"/>
+          <w:lang w:val="pt-PT"/>
+        </w:rPr>
+        <w:t xml:space="preserve"> 3 itens atrasados 1, 1 e 1 dia → (1 + 1 + 1) ÷ 3 = +1,0 d.</w:t>
       </w:r>
     </w:p>
     <w:p>
@@ -2056,7 +2835,7 @@
           <w:szCs w:val="20"/>
           <w:lang w:val="pt-PT"/>
         </w:rPr>
-        <w:t xml:space="preserve">: nº de itens com estado «Produzido» mas sem quantidade produzida (exceto os produzidos hoje).</w:t>
+        <w:t xml:space="preserve">: nº de itens com estado «Produzido» mas sem quantidade produzida registada (não contam os produzidos hoje, que ainda podem estar a ser registados). O ideal é 0.</w:t>
       </w:r>
     </w:p>
     <w:p>
@@ -2096,7 +2875,260 @@
           <w:szCs w:val="20"/>
           <w:lang w:val="pt-PT"/>
         </w:rPr>
-        <w:t xml:space="preserve">: percentagem de itens com matéria-prima / ferramenta OK.</w:t>
+        <w:t xml:space="preserve">: percentagem dos itens com matéria-prima OK / ferramenta OK.</w:t>
+      </w:r>
+    </w:p>
+    <w:p>
+      <w:pPr>
+        <w:keepNext/>
+        <w:spacing w:before="200" w:after="60"/>
+        <w:ind w:left="720"/>
+        <w:rPr>
+          <w:sz w:val="20"/>
+          <w:lang w:val="pt-PT"/>
+        </w:rPr>
+      </w:pPr>
+      <w:r>
+        <w:rPr>
+          <w:rFonts w:cs="Segoe UI"/>
+          <w:b/>
+          <w:bCs/>
+          <w:u w:val="single"/>
+          <w:sz w:val="20"/>
+          <w:szCs w:val="20"/>
+          <w:lang w:val="pt-PT"/>
+        </w:rPr>
+        <w:t xml:space="preserve">Evolução temporal</w:t>
+      </w:r>
+    </w:p>
+    <w:p>
+      <w:pPr>
+        <w:keepNext/>
+        <w:spacing w:before="120" w:after="60"/>
+        <w:jc w:val="center"/>
+      </w:pPr>
+      <w:r>
+        <w:rPr>
+          <w:noProof/>
+          <w:lang w:val="pt-PT"/>
+        </w:rPr>
+        <w:drawing>
+          <wp:inline distT="0" distB="0" distL="0" distR="0">
+            <wp:extent cx="6120000" cy="962057"/>
+            <wp:effectExtent l="0" t="0" r="0" b="0"/>
+            <wp:docPr id="9007" name="Imagem 9007"/>
+            <wp:cNvGraphicFramePr>
+              <a:graphicFrameLocks xmlns:a="http://schemas.openxmlformats.org/drawingml/2006/main" noChangeAspect="1"/>
+            </wp:cNvGraphicFramePr>
+            <a:graphic xmlns:a="http://schemas.openxmlformats.org/drawingml/2006/main">
+              <a:graphicData uri="http://schemas.openxmlformats.org/drawingml/2006/picture">
+                <pic:pic xmlns:pic="http://schemas.openxmlformats.org/drawingml/2006/picture">
+                  <pic:nvPicPr>
+                    <pic:cNvPr id="9007" name="pvp_13_hist_evolucao.png"/>
+                    <pic:cNvPicPr/>
+                  </pic:nvPicPr>
+                  <pic:blipFill>
+                    <a:blip r:embed="rId507"/>
+                    <a:stretch>
+                      <a:fillRect/>
+                    </a:stretch>
+                  </pic:blipFill>
+                  <pic:spPr>
+                    <a:xfrm>
+                      <a:off x="0" y="0"/>
+                      <a:ext cx="6120000" cy="962057"/>
+                    </a:xfrm>
+                    <a:prstGeom prst="rect">
+                      <a:avLst/>
+                    </a:prstGeom>
+                  </pic:spPr>
+                </pic:pic>
+              </a:graphicData>
+            </a:graphic>
+          </wp:inline>
+        </w:drawing>
+      </w:r>
+    </w:p>
+    <w:p>
+      <w:pPr>
+        <w:spacing w:after="60"/>
+        <w:ind w:left="720"/>
+        <w:jc w:val="both"/>
+        <w:rPr>
+          <w:sz w:val="20"/>
+          <w:lang w:val="pt-PT"/>
+        </w:rPr>
+      </w:pPr>
+      <w:r>
+        <w:rPr>
+          <w:rFonts w:cs="Segoe UI"/>
+          <w:sz w:val="20"/>
+          <w:szCs w:val="20"/>
+          <w:lang w:val="pt-PT"/>
+        </w:rPr>
+        <w:t xml:space="preserve">Duas linhas: peças planeadas e peças produzidas. A quantidade planeada conta na data planeada e a quantidade produzida conta na data em que foi produzida. Os valores agrupam-se por dia, semana, mês ou ano, conforme o filtro de período escolhido. Se uma linha estiver abaixo da outra num dia, houve menos produção do que o planeado nesse dia (ou vice-versa).</w:t>
+      </w:r>
+    </w:p>
+    <w:p>
+      <w:pPr>
+        <w:keepNext/>
+        <w:spacing w:before="200" w:after="60"/>
+        <w:ind w:left="720"/>
+        <w:rPr>
+          <w:sz w:val="20"/>
+          <w:lang w:val="pt-PT"/>
+        </w:rPr>
+      </w:pPr>
+      <w:r>
+        <w:rPr>
+          <w:rFonts w:cs="Segoe UI"/>
+          <w:b/>
+          <w:bCs/>
+          <w:u w:val="single"/>
+          <w:sz w:val="20"/>
+          <w:szCs w:val="20"/>
+          <w:lang w:val="pt-PT"/>
+        </w:rPr>
+        <w:t xml:space="preserve">Produzido vs planeado por área e por C.C.</w:t>
+      </w:r>
+    </w:p>
+    <w:p>
+      <w:pPr>
+        <w:keepNext/>
+        <w:spacing w:before="120" w:after="60"/>
+        <w:jc w:val="center"/>
+      </w:pPr>
+      <w:r>
+        <w:rPr>
+          <w:noProof/>
+          <w:lang w:val="pt-PT"/>
+        </w:rPr>
+        <w:drawing>
+          <wp:inline distT="0" distB="0" distL="0" distR="0">
+            <wp:extent cx="6120000" cy="1175005"/>
+            <wp:effectExtent l="0" t="0" r="0" b="0"/>
+            <wp:docPr id="9008" name="Imagem 9008"/>
+            <wp:cNvGraphicFramePr>
+              <a:graphicFrameLocks xmlns:a="http://schemas.openxmlformats.org/drawingml/2006/main" noChangeAspect="1"/>
+            </wp:cNvGraphicFramePr>
+            <a:graphic xmlns:a="http://schemas.openxmlformats.org/drawingml/2006/main">
+              <a:graphicData uri="http://schemas.openxmlformats.org/drawingml/2006/picture">
+                <pic:pic xmlns:pic="http://schemas.openxmlformats.org/drawingml/2006/picture">
+                  <pic:nvPicPr>
+                    <pic:cNvPr id="9008" name="pvp_14_hist_area_cc.png"/>
+                    <pic:cNvPicPr/>
+                  </pic:nvPicPr>
+                  <pic:blipFill>
+                    <a:blip r:embed="rId508"/>
+                    <a:stretch>
+                      <a:fillRect/>
+                    </a:stretch>
+                  </pic:blipFill>
+                  <pic:spPr>
+                    <a:xfrm>
+                      <a:off x="0" y="0"/>
+                      <a:ext cx="6120000" cy="1175005"/>
+                    </a:xfrm>
+                    <a:prstGeom prst="rect">
+                      <a:avLst/>
+                    </a:prstGeom>
+                  </pic:spPr>
+                </pic:pic>
+              </a:graphicData>
+            </a:graphic>
+          </wp:inline>
+        </w:drawing>
+      </w:r>
+    </w:p>
+    <w:p>
+      <w:pPr>
+        <w:spacing w:after="60"/>
+        <w:ind w:left="720"/>
+        <w:jc w:val="both"/>
+        <w:rPr>
+          <w:sz w:val="20"/>
+          <w:lang w:val="pt-PT"/>
+        </w:rPr>
+      </w:pPr>
+      <w:r>
+        <w:rPr>
+          <w:rFonts w:cs="Segoe UI"/>
+          <w:sz w:val="20"/>
+          <w:szCs w:val="20"/>
+          <w:lang w:val="pt-PT"/>
+        </w:rPr>
+        <w:t xml:space="preserve">Para cada área (gráfico da esquerda) e para cada C.C. (gráfico da direita): peças produzidas ÷ peças planeadas. Ao clicar numa área, o gráfico dos C.C. passa a mostrar só os C.C. dessa área.</w:t>
+      </w:r>
+    </w:p>
+    <w:p>
+      <w:pPr>
+        <w:keepNext/>
+        <w:spacing w:before="200" w:after="60"/>
+        <w:ind w:left="720"/>
+        <w:rPr>
+          <w:sz w:val="20"/>
+          <w:lang w:val="pt-PT"/>
+        </w:rPr>
+      </w:pPr>
+      <w:r>
+        <w:rPr>
+          <w:rFonts w:cs="Segoe UI"/>
+          <w:b/>
+          <w:bCs/>
+          <w:u w:val="single"/>
+          <w:sz w:val="20"/>
+          <w:szCs w:val="20"/>
+          <w:lang w:val="pt-PT"/>
+        </w:rPr>
+        <w:t xml:space="preserve">Cumprimento do prazo, interrupções e causa raiz</w:t>
+      </w:r>
+    </w:p>
+    <w:p>
+      <w:pPr>
+        <w:keepNext/>
+        <w:spacing w:before="120" w:after="60"/>
+        <w:jc w:val="center"/>
+      </w:pPr>
+      <w:r>
+        <w:rPr>
+          <w:noProof/>
+          <w:lang w:val="pt-PT"/>
+        </w:rPr>
+        <w:drawing>
+          <wp:inline distT="0" distB="0" distL="0" distR="0">
+            <wp:extent cx="6120000" cy="1105632"/>
+            <wp:effectExtent l="0" t="0" r="0" b="0"/>
+            <wp:docPr id="9009" name="Imagem 9009"/>
+            <wp:cNvGraphicFramePr>
+              <a:graphicFrameLocks xmlns:a="http://schemas.openxmlformats.org/drawingml/2006/main" noChangeAspect="1"/>
+            </wp:cNvGraphicFramePr>
+            <a:graphic xmlns:a="http://schemas.openxmlformats.org/drawingml/2006/main">
+              <a:graphicData uri="http://schemas.openxmlformats.org/drawingml/2006/picture">
+                <pic:pic xmlns:pic="http://schemas.openxmlformats.org/drawingml/2006/picture">
+                  <pic:nvPicPr>
+                    <pic:cNvPr id="9009" name="pvp_15_hist_prazo.png"/>
+                    <pic:cNvPicPr/>
+                  </pic:nvPicPr>
+                  <pic:blipFill>
+                    <a:blip r:embed="rId509"/>
+                    <a:stretch>
+                      <a:fillRect/>
+                    </a:stretch>
+                  </pic:blipFill>
+                  <pic:spPr>
+                    <a:xfrm>
+                      <a:off x="0" y="0"/>
+                      <a:ext cx="6120000" cy="1105632"/>
+                    </a:xfrm>
+                    <a:prstGeom prst="rect">
+                      <a:avLst/>
+                    </a:prstGeom>
+                  </pic:spPr>
+                </pic:pic>
+              </a:graphicData>
+            </a:graphic>
+          </wp:inline>
+        </w:drawing>
       </w:r>
     </w:p>
     <w:p>
@@ -2127,16 +3159,16 @@
           <w:szCs w:val="20"/>
           <w:lang w:val="pt-PT"/>
         </w:rPr>
-        <w:t xml:space="preserve">% de Interrupções</w:t>
-      </w:r>
-      <w:r>
-        <w:rPr>
-          <w:rFonts w:cs="Segoe UI"/>
-          <w:sz w:val="20"/>
-          <w:szCs w:val="20"/>
-          <w:lang w:val="pt-PT"/>
-        </w:rPr>
-        <w:t xml:space="preserve">: nº de interrupções ÷ nº de produções, por C.C. ou KA.</w:t>
+        <w:t xml:space="preserve">Cumprimento do Prazo</w:t>
+      </w:r>
+      <w:r>
+        <w:rPr>
+          <w:rFonts w:cs="Segoe UI"/>
+          <w:sz w:val="20"/>
+          <w:szCs w:val="20"/>
+          <w:lang w:val="pt-PT"/>
+        </w:rPr>
+        <w:t xml:space="preserve">: cada item produzido é comparado com a sua data planeada: produzido no mesmo dia = «No Prazo»; depois = «Atrasado»; antes = «Adiantado». O gráfico mostra a percentagem de cada grupo.</w:t>
       </w:r>
     </w:p>
     <w:p>
@@ -2167,16 +3199,269 @@
           <w:szCs w:val="20"/>
           <w:lang w:val="pt-PT"/>
         </w:rPr>
-        <w:t xml:space="preserve">Média de bobines</w:t>
-      </w:r>
-      <w:r>
-        <w:rPr>
-          <w:rFonts w:cs="Segoe UI"/>
-          <w:sz w:val="20"/>
-          <w:szCs w:val="20"/>
-          <w:lang w:val="pt-PT"/>
-        </w:rPr>
-        <w:t xml:space="preserve">: bobines abastecidas ÷ nº de produções já produzidas com bobines registadas.</w:t>
+        <w:t xml:space="preserve">% de Interrupções</w:t>
+      </w:r>
+      <w:r>
+        <w:rPr>
+          <w:rFonts w:cs="Segoe UI"/>
+          <w:sz w:val="20"/>
+          <w:szCs w:val="20"/>
+          <w:lang w:val="pt-PT"/>
+        </w:rPr>
+        <w:t xml:space="preserve">: nº de interrupções ÷ nº de produções, por C.C. ou por KA (botões no canto). Só aparecem os C.C./KA com interrupções; a lista tem scroll. Por cima aparecem os totais.</w:t>
+      </w:r>
+    </w:p>
+    <w:p>
+      <w:pPr>
+        <w:spacing w:after="60"/>
+        <w:ind w:left="1080"/>
+        <w:jc w:val="both"/>
+        <w:rPr>
+          <w:sz w:val="20"/>
+          <w:lang w:val="pt-PT"/>
+        </w:rPr>
+      </w:pPr>
+      <w:r>
+        <w:rPr>
+          <w:rFonts w:cs="Segoe UI"/>
+          <w:b/>
+          <w:bCs/>
+          <w:sz w:val="20"/>
+          <w:szCs w:val="20"/>
+          <w:lang w:val="pt-PT"/>
+        </w:rPr>
+        <w:t xml:space="preserve">Exemplo:</w:t>
+      </w:r>
+      <w:r>
+        <w:rPr>
+          <w:rFonts w:cs="Segoe UI"/>
+          <w:sz w:val="20"/>
+          <w:szCs w:val="20"/>
+          <w:lang w:val="pt-PT"/>
+        </w:rPr>
+        <w:t xml:space="preserve"> um C.C. com 9 produções e 4 interrupções → 4 ÷ 9 = 44%. Pode passar os 100% se houver várias paragens na mesma produção.</w:t>
+      </w:r>
+    </w:p>
+    <w:p>
+      <w:pPr>
+        <w:spacing w:after="40"/>
+        <w:ind w:left="1080" w:hanging="220"/>
+        <w:jc w:val="both"/>
+        <w:rPr>
+          <w:sz w:val="20"/>
+          <w:lang w:val="pt-PT"/>
+        </w:rPr>
+      </w:pPr>
+      <w:r>
+        <w:rPr>
+          <w:rFonts w:cs="Segoe UI"/>
+          <w:sz w:val="20"/>
+          <w:szCs w:val="20"/>
+          <w:lang w:val="pt-PT"/>
+        </w:rPr>
+        <w:t xml:space="preserve">– </w:t>
+      </w:r>
+      <w:r>
+        <w:rPr>
+          <w:rFonts w:cs="Segoe UI"/>
+          <w:b/>
+          <w:bCs/>
+          <w:sz w:val="20"/>
+          <w:szCs w:val="20"/>
+          <w:lang w:val="pt-PT"/>
+        </w:rPr>
+        <w:t xml:space="preserve">Causa Raiz dos Desvios</w:t>
+      </w:r>
+      <w:r>
+        <w:rPr>
+          <w:rFonts w:cs="Segoe UI"/>
+          <w:sz w:val="20"/>
+          <w:szCs w:val="20"/>
+          <w:lang w:val="pt-PT"/>
+        </w:rPr>
+        <w:t xml:space="preserve">: conta quantos itens têm cada causa registada e mostra a percentagem de cada uma no total de itens com causa. Itens sem causa preenchida não entram.</w:t>
+      </w:r>
+    </w:p>
+    <w:p>
+      <w:pPr>
+        <w:keepNext/>
+        <w:spacing w:before="200" w:after="60"/>
+        <w:ind w:left="720"/>
+        <w:rPr>
+          <w:sz w:val="20"/>
+          <w:lang w:val="pt-PT"/>
+        </w:rPr>
+      </w:pPr>
+      <w:r>
+        <w:rPr>
+          <w:rFonts w:cs="Segoe UI"/>
+          <w:b/>
+          <w:bCs/>
+          <w:u w:val="single"/>
+          <w:sz w:val="20"/>
+          <w:szCs w:val="20"/>
+          <w:lang w:val="pt-PT"/>
+        </w:rPr>
+        <w:t xml:space="preserve">Bobines abastecidas e nº de produções</w:t>
+      </w:r>
+    </w:p>
+    <w:p>
+      <w:pPr>
+        <w:keepNext/>
+        <w:spacing w:before="120" w:after="60"/>
+        <w:jc w:val="center"/>
+      </w:pPr>
+      <w:r>
+        <w:rPr>
+          <w:noProof/>
+          <w:lang w:val="pt-PT"/>
+        </w:rPr>
+        <w:drawing>
+          <wp:inline distT="0" distB="0" distL="0" distR="0">
+            <wp:extent cx="6120000" cy="1324590"/>
+            <wp:effectExtent l="0" t="0" r="0" b="0"/>
+            <wp:docPr id="9010" name="Imagem 9010"/>
+            <wp:cNvGraphicFramePr>
+              <a:graphicFrameLocks xmlns:a="http://schemas.openxmlformats.org/drawingml/2006/main" noChangeAspect="1"/>
+            </wp:cNvGraphicFramePr>
+            <a:graphic xmlns:a="http://schemas.openxmlformats.org/drawingml/2006/main">
+              <a:graphicData uri="http://schemas.openxmlformats.org/drawingml/2006/picture">
+                <pic:pic xmlns:pic="http://schemas.openxmlformats.org/drawingml/2006/picture">
+                  <pic:nvPicPr>
+                    <pic:cNvPr id="9010" name="pvp_16_hist_producoes.png"/>
+                    <pic:cNvPicPr/>
+                  </pic:nvPicPr>
+                  <pic:blipFill>
+                    <a:blip r:embed="rId510"/>
+                    <a:stretch>
+                      <a:fillRect/>
+                    </a:stretch>
+                  </pic:blipFill>
+                  <pic:spPr>
+                    <a:xfrm>
+                      <a:off x="0" y="0"/>
+                      <a:ext cx="6120000" cy="1324590"/>
+                    </a:xfrm>
+                    <a:prstGeom prst="rect">
+                      <a:avLst/>
+                    </a:prstGeom>
+                  </pic:spPr>
+                </pic:pic>
+              </a:graphicData>
+            </a:graphic>
+          </wp:inline>
+        </w:drawing>
+      </w:r>
+    </w:p>
+    <w:p>
+      <w:pPr>
+        <w:spacing w:after="40"/>
+        <w:ind w:left="1080" w:hanging="220"/>
+        <w:jc w:val="both"/>
+        <w:rPr>
+          <w:sz w:val="20"/>
+          <w:lang w:val="pt-PT"/>
+        </w:rPr>
+      </w:pPr>
+      <w:r>
+        <w:rPr>
+          <w:rFonts w:cs="Segoe UI"/>
+          <w:sz w:val="20"/>
+          <w:szCs w:val="20"/>
+          <w:lang w:val="pt-PT"/>
+        </w:rPr>
+        <w:t xml:space="preserve">– </w:t>
+      </w:r>
+      <w:r>
+        <w:rPr>
+          <w:rFonts w:cs="Segoe UI"/>
+          <w:b/>
+          <w:bCs/>
+          <w:sz w:val="20"/>
+          <w:szCs w:val="20"/>
+          <w:lang w:val="pt-PT"/>
+        </w:rPr>
+        <w:t xml:space="preserve">Média Bobines Abastecidas por Produção</w:t>
+      </w:r>
+      <w:r>
+        <w:rPr>
+          <w:rFonts w:cs="Segoe UI"/>
+          <w:sz w:val="20"/>
+          <w:szCs w:val="20"/>
+          <w:lang w:val="pt-PT"/>
+        </w:rPr>
+        <w:t xml:space="preserve">: nº de bobines ÷ nº de produções, por KA ou por C.C. Só contam as produções com estado «Produzido» e com bobines registadas.</w:t>
+      </w:r>
+    </w:p>
+    <w:p>
+      <w:pPr>
+        <w:spacing w:after="60"/>
+        <w:ind w:left="1080"/>
+        <w:jc w:val="both"/>
+        <w:rPr>
+          <w:sz w:val="20"/>
+          <w:lang w:val="pt-PT"/>
+        </w:rPr>
+      </w:pPr>
+      <w:r>
+        <w:rPr>
+          <w:rFonts w:cs="Segoe UI"/>
+          <w:b/>
+          <w:bCs/>
+          <w:sz w:val="20"/>
+          <w:szCs w:val="20"/>
+          <w:lang w:val="pt-PT"/>
+        </w:rPr>
+        <w:t xml:space="preserve">Exemplo:</w:t>
+      </w:r>
+      <w:r>
+        <w:rPr>
+          <w:rFonts w:cs="Segoe UI"/>
+          <w:sz w:val="20"/>
+          <w:szCs w:val="20"/>
+          <w:lang w:val="pt-PT"/>
+        </w:rPr>
+        <w:t xml:space="preserve"> um KA com 3 produções e 12 bobines → 12 ÷ 3 = 4,0.</w:t>
+      </w:r>
+    </w:p>
+    <w:p>
+      <w:pPr>
+        <w:spacing w:after="40"/>
+        <w:ind w:left="1080" w:hanging="220"/>
+        <w:jc w:val="both"/>
+        <w:rPr>
+          <w:sz w:val="20"/>
+          <w:lang w:val="pt-PT"/>
+        </w:rPr>
+      </w:pPr>
+      <w:r>
+        <w:rPr>
+          <w:rFonts w:cs="Segoe UI"/>
+          <w:sz w:val="20"/>
+          <w:szCs w:val="20"/>
+          <w:lang w:val="pt-PT"/>
+        </w:rPr>
+        <w:t xml:space="preserve">– </w:t>
+      </w:r>
+      <w:r>
+        <w:rPr>
+          <w:rFonts w:cs="Segoe UI"/>
+          <w:b/>
+          <w:bCs/>
+          <w:sz w:val="20"/>
+          <w:szCs w:val="20"/>
+          <w:lang w:val="pt-PT"/>
+        </w:rPr>
+        <w:t xml:space="preserve">Nº Produções</w:t>
+      </w:r>
+      <w:r>
+        <w:rPr>
+          <w:rFonts w:cs="Segoe UI"/>
+          <w:sz w:val="20"/>
+          <w:szCs w:val="20"/>
+          <w:lang w:val="pt-PT"/>
+        </w:rPr>
+        <w:t xml:space="preserve">: nº de linhas do plano de cada KA ou C.C. dentro dos filtros escolhidos.</w:t>
       </w:r>
     </w:p>
     <w:sectPr>

</xml_diff>